<commit_message>
Update Academic CV with verified ABU lecturer ranks, MIT email, and References section
</commit_message>
<xml_diff>
--- a/academic_cv.docx
+++ b/academic_cv.docx
@@ -3,1432 +3,550 @@
 <w:document xmlns:wpc="http://schemas.microsoft.com/office/word/2010/wordprocessingCanvas" xmlns:mo="http://schemas.microsoft.com/office/mac/office/2008/main" xmlns:mc="http://schemas.openxmlformats.org/markup-compatibility/2006" xmlns:mv="urn:schemas-microsoft-com:mac:vml" xmlns:o="urn:schemas-microsoft-com:office:office" xmlns:r="http://schemas.openxmlformats.org/officeDocument/2006/relationships" xmlns:m="http://schemas.openxmlformats.org/officeDocument/2006/math" xmlns:v="urn:schemas-microsoft-com:vml" xmlns:wp14="http://schemas.microsoft.com/office/word/2010/wordprocessingDrawing" xmlns:wp="http://schemas.openxmlformats.org/drawingml/2006/wordprocessingDrawing" xmlns:w10="urn:schemas-microsoft-com:office:word" xmlns:w="http://schemas.openxmlformats.org/wordprocessingml/2006/main" xmlns:w14="http://schemas.microsoft.com/office/word/2010/wordml" xmlns:wpg="http://schemas.microsoft.com/office/word/2010/wordprocessingGroup" xmlns:wpi="http://schemas.microsoft.com/office/word/2010/wordprocessingInk" xmlns:wne="http://schemas.microsoft.com/office/word/2006/wordml" xmlns:wps="http://schemas.microsoft.com/office/word/2010/wordprocessingShape" mc:Ignorable="w14 wp14">
   <w:body>
     <w:p>
-      <w:pPr>
-        <w:spacing w:after="40" w:before="0"/>
-        <w:jc w:val="center"/>
-      </w:pPr>
       <w:r>
-        <w:rPr>
-          <w:rFonts w:ascii="Calibri" w:hAnsi="Calibri"/>
-          <w:b/>
-          <w:color w:val="1A365D"/>
-          <w:sz w:val="40"/>
-        </w:rPr>
-        <w:t>HADIZA MOHAMMED</w:t>
+        <w:t># HADIZA MOHAMMED</w:t>
       </w:r>
     </w:p>
     <w:p>
-      <w:pPr>
-        <w:spacing w:after="160" w:before="0"/>
-        <w:jc w:val="center"/>
-      </w:pPr>
       <w:r>
-        <w:rPr>
-          <w:rFonts w:ascii="Calibri" w:hAnsi="Calibri"/>
-          <w:color w:val="444444"/>
-          <w:sz w:val="19"/>
-        </w:rPr>
-        <w:t>Nigeria  |  +234 916 101 8275  |  mohammedhardeeza@gmail.com</w:t>
-        <w:br/>
-        <w:t>GitHub: github.com/Hardeezah  |  LinkedIn: linkedin.com/in/hadiza-mohammed  |  Zenodo DOI: 10.5281/zenodo.22287430</w:t>
+        <w:t xml:space="preserve">Nigeria | +234 916 101 8275 | mohammedhardeeza@gmail.com  </w:t>
       </w:r>
     </w:p>
     <w:p>
-      <w:pPr>
-        <w:spacing w:before="180" w:after="60"/>
-        <w:pBdr>
-          <w:bottom w:val="single" w:sz="8" w:space="2" w:color="1A365D"/>
-        </w:pBdr>
-      </w:pPr>
       <w:r>
-        <w:rPr>
-          <w:rFonts w:ascii="Calibri" w:hAnsi="Calibri"/>
-          <w:b/>
-          <w:color w:val="1A365D"/>
-          <w:sz w:val="22"/>
-        </w:rPr>
-        <w:t>RESEARCH INTERESTS</w:t>
+        <w:t>GitHub: github.com/Hardeezah | LinkedIn: linkedin.com/in/hadiza-mohammed | ORCID / Zenodo: doi.org/10.5281/zenodo.22287430</w:t>
+      </w:r>
+    </w:p>
+    <w:p/>
+    <w:p>
+      <w:r>
+        <w:t>---</w:t>
+      </w:r>
+    </w:p>
+    <w:p/>
+    <w:p>
+      <w:r>
+        <w:t>### RESEARCH INTERESTS</w:t>
       </w:r>
     </w:p>
     <w:p>
-      <w:pPr>
-        <w:spacing w:before="40" w:after="40" w:line="264" w:lineRule="auto"/>
-      </w:pPr>
       <w:r>
-        <w:rPr>
-          <w:rFonts w:ascii="Calibri" w:hAnsi="Calibri"/>
-          <w:b w:val="0"/>
-          <w:color w:val="222222"/>
-          <w:sz w:val="19"/>
-        </w:rPr>
         <w:t>Efficient Deep Learning Systems | TinyML &amp; Edge Intelligence | Hardware-Software Co-Design | Neural Network Quantization &amp; Compression | Distributed &amp; On-Device ML | Systems for Embedded Computer Vision</w:t>
       </w:r>
     </w:p>
+    <w:p/>
     <w:p>
-      <w:pPr>
-        <w:spacing w:before="180" w:after="60"/>
-        <w:pBdr>
-          <w:bottom w:val="single" w:sz="8" w:space="2" w:color="1A365D"/>
-        </w:pBdr>
-      </w:pPr>
       <w:r>
-        <w:rPr>
-          <w:rFonts w:ascii="Calibri" w:hAnsi="Calibri"/>
-          <w:b/>
-          <w:color w:val="1A365D"/>
-          <w:sz w:val="22"/>
-        </w:rPr>
-        <w:t>EDUCATION</w:t>
+        <w:t>---</w:t>
+      </w:r>
+    </w:p>
+    <w:p/>
+    <w:p>
+      <w:r>
+        <w:t>### EDUCATION</w:t>
+      </w:r>
+    </w:p>
+    <w:p/>
+    <w:p>
+      <w:r>
+        <w:t xml:space="preserve">**Ahmadu Bello University**, Zaria, Nigeria  </w:t>
       </w:r>
     </w:p>
     <w:p>
-      <w:pPr>
-        <w:spacing w:before="40" w:after="40" w:line="264" w:lineRule="auto"/>
-      </w:pPr>
       <w:r>
-        <w:rPr>
-          <w:rFonts w:ascii="Calibri" w:hAnsi="Calibri"/>
-          <w:b w:val="0"/>
-          <w:color w:val="222222"/>
-          <w:sz w:val="19"/>
-        </w:rPr>
-        <w:t>Ahmadu Bello University</w:t>
-      </w:r>
-      <w:r>
-        <w:rPr>
-          <w:rFonts w:ascii="Calibri" w:hAnsi="Calibri"/>
-          <w:b/>
-          <w:color w:val="222222"/>
-          <w:sz w:val="19"/>
-        </w:rPr>
-        <w:t>, Zaria, Nigeria</w:t>
+        <w:t xml:space="preserve">*Bachelor of Science in Computer Science* (First Class Honours) | Dec 2020 – Jul 2025  </w:t>
       </w:r>
     </w:p>
     <w:p>
-      <w:pPr>
-        <w:spacing w:before="40" w:after="40" w:line="264" w:lineRule="auto"/>
-      </w:pPr>
       <w:r>
-        <w:rPr>
-          <w:rFonts w:ascii="Calibri" w:hAnsi="Calibri"/>
-          <w:b w:val="0"/>
-          <w:color w:val="222222"/>
-          <w:sz w:val="19"/>
-        </w:rPr>
-        <w:t>*Bachelor of Science in Computer Science* (First Class Honours) | Dec 2020 – Jul 2025</w:t>
+        <w:t xml:space="preserve">* **Cumulative GPA:** 4.53 / 5.00  </w:t>
       </w:r>
     </w:p>
     <w:p>
-      <w:pPr>
-        <w:pStyle w:val="ListBullet"/>
-        <w:spacing w:before="0" w:after="40" w:line="264" w:lineRule="auto"/>
-      </w:pPr>
       <w:r>
-        <w:rPr>
-          <w:rFonts w:ascii="Calibri" w:hAnsi="Calibri"/>
-          <w:b w:val="0"/>
-          <w:color w:val="222222"/>
-          <w:sz w:val="19"/>
-        </w:rPr>
-        <w:t>Cumulative GPA:</w:t>
-      </w:r>
-      <w:r>
-        <w:rPr>
-          <w:rFonts w:ascii="Calibri" w:hAnsi="Calibri"/>
-          <w:b/>
-          <w:color w:val="222222"/>
-          <w:sz w:val="19"/>
-        </w:rPr>
-        <w:t xml:space="preserve"> 4.53 / 5.00</w:t>
+        <w:t>* **Academic Honors:** Ranked Best Female Computer Science Graduate across the graduating class.</w:t>
       </w:r>
     </w:p>
     <w:p>
-      <w:pPr>
-        <w:pStyle w:val="ListBullet"/>
-        <w:spacing w:before="0" w:after="40" w:line="264" w:lineRule="auto"/>
-      </w:pPr>
       <w:r>
-        <w:rPr>
-          <w:rFonts w:ascii="Calibri" w:hAnsi="Calibri"/>
-          <w:b w:val="0"/>
-          <w:color w:val="222222"/>
-          <w:sz w:val="19"/>
-        </w:rPr>
-        <w:t>Academic Honors:</w:t>
-      </w:r>
-      <w:r>
-        <w:rPr>
-          <w:rFonts w:ascii="Calibri" w:hAnsi="Calibri"/>
-          <w:b/>
-          <w:color w:val="222222"/>
-          <w:sz w:val="19"/>
-        </w:rPr>
-        <w:t xml:space="preserve"> Ranked Best Female Computer Science Graduate across the graduating class.</w:t>
+        <w:t>* **Undergraduate Thesis:** *Autonomous Multi-Modal Crop Disease Detection and Soil Analysis on Resource-Constrained Edge Processors* (Supervised by Mrs. Safinatu Zakari).</w:t>
       </w:r>
     </w:p>
     <w:p>
-      <w:pPr>
-        <w:pStyle w:val="ListBullet"/>
-        <w:spacing w:before="0" w:after="40" w:line="264" w:lineRule="auto"/>
-      </w:pPr>
       <w:r>
-        <w:rPr>
-          <w:rFonts w:ascii="Calibri" w:hAnsi="Calibri"/>
-          <w:b w:val="0"/>
-          <w:color w:val="222222"/>
-          <w:sz w:val="19"/>
-        </w:rPr>
-        <w:t>Undergraduate Thesis:</w:t>
+        <w:t>* **Core Coursework:** Computer Architecture, Operating Systems, Algorithm Analysis &amp; Design, Linear Algebra, Optimization Theory, Numerical Analysis, Distributed Computing, Database Systems.</w:t>
       </w:r>
+    </w:p>
+    <w:p/>
+    <w:p>
       <w:r>
-        <w:rPr>
-          <w:rFonts w:ascii="Calibri" w:hAnsi="Calibri"/>
-          <w:b/>
-          <w:color w:val="222222"/>
-          <w:sz w:val="19"/>
-        </w:rPr>
-        <w:t xml:space="preserve"> *Autonomous Multi-Modal Crop Disease Detection and Soil Analysis on Resource-Constrained Edge Processors* (Supervised by Mrs. Safinatu Zakari).</w:t>
+        <w:t>---</w:t>
+      </w:r>
+    </w:p>
+    <w:p/>
+    <w:p>
+      <w:r>
+        <w:t>### HONORS &amp; MAJOR AWARDS</w:t>
+      </w:r>
+    </w:p>
+    <w:p/>
+    <w:p>
+      <w:r>
+        <w:t xml:space="preserve">* **Global Champion (1st Place Globally), Huawei ICT Innovation Competition Finals**, Shenzhen, China (2025)  </w:t>
       </w:r>
     </w:p>
     <w:p>
-      <w:pPr>
-        <w:pStyle w:val="ListBullet"/>
-        <w:spacing w:before="0" w:after="40" w:line="264" w:lineRule="auto"/>
-      </w:pPr>
       <w:r>
-        <w:rPr>
-          <w:rFonts w:ascii="Calibri" w:hAnsi="Calibri"/>
-          <w:b w:val="0"/>
-          <w:color w:val="222222"/>
-          <w:sz w:val="19"/>
-        </w:rPr>
-        <w:t>Core Coursework:</w:t>
-      </w:r>
-      <w:r>
-        <w:rPr>
-          <w:rFonts w:ascii="Calibri" w:hAnsi="Calibri"/>
-          <w:b/>
-          <w:color w:val="222222"/>
-          <w:sz w:val="19"/>
-        </w:rPr>
-        <w:t xml:space="preserve"> Computer Architecture, Operating Systems, Algorithm Analysis &amp; Design, Linear Algebra, Optimization Theory, Numerical Analysis, Distributed Computing, Database Systems.</w:t>
+        <w:t xml:space="preserve">  * Outperformed thousands of international teams with *CropDiseaseDetector / AgroGuardian*; led edge hardware deployment and real-time inference optimization on embedded NPUs.</w:t>
       </w:r>
     </w:p>
     <w:p>
-      <w:pPr>
-        <w:spacing w:before="180" w:after="60"/>
-        <w:pBdr>
-          <w:bottom w:val="single" w:sz="8" w:space="2" w:color="1A365D"/>
-        </w:pBdr>
-      </w:pPr>
       <w:r>
-        <w:rPr>
-          <w:rFonts w:ascii="Calibri" w:hAnsi="Calibri"/>
-          <w:b/>
-          <w:color w:val="1A365D"/>
-          <w:sz w:val="22"/>
-        </w:rPr>
-        <w:t>HONORS &amp; MAJOR AWARDS</w:t>
+        <w:t>* **1st Place, Huawei ICT Innovation Competition**, Southern Africa Regional Finals (2025)</w:t>
       </w:r>
     </w:p>
     <w:p>
-      <w:pPr>
-        <w:pStyle w:val="ListBullet"/>
-        <w:spacing w:before="0" w:after="40" w:line="264" w:lineRule="auto"/>
-      </w:pPr>
       <w:r>
-        <w:rPr>
-          <w:rFonts w:ascii="Calibri" w:hAnsi="Calibri"/>
-          <w:b w:val="0"/>
-          <w:color w:val="222222"/>
-          <w:sz w:val="19"/>
-        </w:rPr>
-        <w:t>Global Champion (1st Place Globally), Huawei ICT Innovation Competition Finals</w:t>
-      </w:r>
-      <w:r>
-        <w:rPr>
-          <w:rFonts w:ascii="Calibri" w:hAnsi="Calibri"/>
-          <w:b/>
-          <w:color w:val="222222"/>
-          <w:sz w:val="19"/>
-        </w:rPr>
-        <w:t>, Shenzhen, China (2025)</w:t>
+        <w:t>* **National Winner, Huawei ICT Innovation Competition**, Nigeria (2024, 2025)</w:t>
       </w:r>
     </w:p>
     <w:p>
-      <w:pPr>
-        <w:pStyle w:val="ListBullet"/>
-        <w:spacing w:before="0" w:after="40" w:line="264" w:lineRule="auto"/>
-      </w:pPr>
       <w:r>
-        <w:rPr>
-          <w:rFonts w:ascii="Calibri" w:hAnsi="Calibri"/>
-          <w:b w:val="0"/>
-          <w:color w:val="222222"/>
-          <w:sz w:val="19"/>
-        </w:rPr>
-        <w:t>Outperformed thousands of international teams with *CropDiseaseDetector / AgroGuardian*; led edge hardware deployment and real-time inference optimization on embedded NPUs.</w:t>
+        <w:t xml:space="preserve">* **1st Place, Nigeria MATLAB Student Coding Challenge** (2024)  </w:t>
       </w:r>
     </w:p>
     <w:p>
-      <w:pPr>
-        <w:pStyle w:val="ListBullet"/>
-        <w:spacing w:before="0" w:after="40" w:line="264" w:lineRule="auto"/>
-      </w:pPr>
       <w:r>
-        <w:rPr>
-          <w:rFonts w:ascii="Calibri" w:hAnsi="Calibri"/>
-          <w:b w:val="0"/>
-          <w:color w:val="222222"/>
-          <w:sz w:val="19"/>
-        </w:rPr>
-        <w:t>1st Place, Huawei ICT Innovation Competition</w:t>
-      </w:r>
-      <w:r>
-        <w:rPr>
-          <w:rFonts w:ascii="Calibri" w:hAnsi="Calibri"/>
-          <w:b/>
-          <w:color w:val="222222"/>
-          <w:sz w:val="19"/>
-        </w:rPr>
-        <w:t>, Southern Africa Regional Finals (2025)</w:t>
+        <w:t xml:space="preserve">  * Developed an algorithmic soil nutrient deficiency analysis model using multi-variable regression.</w:t>
       </w:r>
     </w:p>
     <w:p>
-      <w:pPr>
-        <w:pStyle w:val="ListBullet"/>
-        <w:spacing w:before="0" w:after="40" w:line="264" w:lineRule="auto"/>
-      </w:pPr>
       <w:r>
-        <w:rPr>
-          <w:rFonts w:ascii="Calibri" w:hAnsi="Calibri"/>
-          <w:b w:val="0"/>
-          <w:color w:val="222222"/>
-          <w:sz w:val="19"/>
-        </w:rPr>
-        <w:t>National Winner, Huawei ICT Innovation Competition</w:t>
-      </w:r>
-      <w:r>
-        <w:rPr>
-          <w:rFonts w:ascii="Calibri" w:hAnsi="Calibri"/>
-          <w:b/>
-          <w:color w:val="222222"/>
-          <w:sz w:val="19"/>
-        </w:rPr>
-        <w:t>, Nigeria (2024, 2025)</w:t>
+        <w:t xml:space="preserve">* **2nd Place, International Youth Debates &amp; Case Championships (VEHUB4YOU / Erasmus+)**, Kyiv National University of Technologies and Design (2025)  </w:t>
       </w:r>
     </w:p>
     <w:p>
-      <w:pPr>
-        <w:pStyle w:val="ListBullet"/>
-        <w:spacing w:before="0" w:after="40" w:line="264" w:lineRule="auto"/>
-      </w:pPr>
       <w:r>
-        <w:rPr>
-          <w:rFonts w:ascii="Calibri" w:hAnsi="Calibri"/>
-          <w:b w:val="0"/>
-          <w:color w:val="222222"/>
-          <w:sz w:val="19"/>
-        </w:rPr>
-        <w:t>1st Place, Nigeria MATLAB Student Coding Challenge</w:t>
-      </w:r>
-      <w:r>
-        <w:rPr>
-          <w:rFonts w:ascii="Calibri" w:hAnsi="Calibri"/>
-          <w:b/>
-          <w:color w:val="222222"/>
-          <w:sz w:val="19"/>
-        </w:rPr>
-        <w:t xml:space="preserve"> (2024)</w:t>
+        <w:t xml:space="preserve">  * Awarded research study fellowship at the University of Foggia, Italy.</w:t>
       </w:r>
     </w:p>
     <w:p>
-      <w:pPr>
-        <w:pStyle w:val="ListBullet"/>
-        <w:spacing w:before="0" w:after="40" w:line="264" w:lineRule="auto"/>
-      </w:pPr>
       <w:r>
-        <w:rPr>
-          <w:rFonts w:ascii="Calibri" w:hAnsi="Calibri"/>
-          <w:b w:val="0"/>
-          <w:color w:val="222222"/>
-          <w:sz w:val="19"/>
-        </w:rPr>
-        <w:t>Developed an algorithmic soil nutrient deficiency analysis model using multi-variable regression.</w:t>
+        <w:t>* **Selected National Representative, Huawei ICT Leadership Bootcamp**, Shenzhen, China (Nov 2024)</w:t>
       </w:r>
     </w:p>
     <w:p>
-      <w:pPr>
-        <w:pStyle w:val="ListBullet"/>
-        <w:spacing w:before="0" w:after="40" w:line="264" w:lineRule="auto"/>
-      </w:pPr>
       <w:r>
-        <w:rPr>
-          <w:rFonts w:ascii="Calibri" w:hAnsi="Calibri"/>
-          <w:b w:val="0"/>
-          <w:color w:val="222222"/>
-          <w:sz w:val="19"/>
-        </w:rPr>
-        <w:t>2nd Place, International Youth Debates &amp; Case Championships (VEHUB4YOU / Erasmus+)</w:t>
+        <w:t>* **Michael Taiwo Graduate School Application Fellowship** (2026)</w:t>
       </w:r>
+    </w:p>
+    <w:p/>
+    <w:p>
       <w:r>
-        <w:rPr>
-          <w:rFonts w:ascii="Calibri" w:hAnsi="Calibri"/>
-          <w:b/>
-          <w:color w:val="222222"/>
-          <w:sz w:val="19"/>
-        </w:rPr>
-        <w:t>, Kyiv National University of Technologies and Design (2025)</w:t>
+        <w:t>---</w:t>
+      </w:r>
+    </w:p>
+    <w:p/>
+    <w:p>
+      <w:r>
+        <w:t>### PUBLICATIONS &amp; TECHNICAL REPORTS</w:t>
+      </w:r>
+    </w:p>
+    <w:p/>
+    <w:p>
+      <w:r>
+        <w:t xml:space="preserve">* **H. Mohammed**, S. Ibrahim, D. L. Haruna, Z. Haruna, S. Zakari.  </w:t>
       </w:r>
     </w:p>
     <w:p>
-      <w:pPr>
-        <w:pStyle w:val="ListBullet"/>
-        <w:spacing w:before="0" w:after="40" w:line="264" w:lineRule="auto"/>
-      </w:pPr>
       <w:r>
-        <w:rPr>
-          <w:rFonts w:ascii="Calibri" w:hAnsi="Calibri"/>
-          <w:b w:val="0"/>
-          <w:color w:val="222222"/>
-          <w:sz w:val="19"/>
-        </w:rPr>
-        <w:t>Awarded research study fellowship at the University of Foggia, Italy.</w:t>
+        <w:t xml:space="preserve">  *"CropDiseaseDetector: Autonomous Multi-Modal Edge Intelligence on Ultra-Low-Power Neural Processing Units."*  </w:t>
       </w:r>
     </w:p>
     <w:p>
-      <w:pPr>
-        <w:pStyle w:val="ListBullet"/>
-        <w:spacing w:before="0" w:after="40" w:line="264" w:lineRule="auto"/>
-      </w:pPr>
       <w:r>
-        <w:rPr>
-          <w:rFonts w:ascii="Calibri" w:hAnsi="Calibri"/>
-          <w:b w:val="0"/>
-          <w:color w:val="222222"/>
-          <w:sz w:val="19"/>
-        </w:rPr>
-        <w:t>Selected National Representative, Huawei ICT Leadership Bootcamp</w:t>
-      </w:r>
-      <w:r>
-        <w:rPr>
-          <w:rFonts w:ascii="Calibri" w:hAnsi="Calibri"/>
-          <w:b/>
-          <w:color w:val="222222"/>
-          <w:sz w:val="19"/>
-        </w:rPr>
-        <w:t>, Shenzhen, China (Nov 2024)</w:t>
+        <w:t xml:space="preserve">  Technical Research Report, Zenodo, 2025. **DOI: 10.5281/zenodo.22287430**  </w:t>
       </w:r>
     </w:p>
     <w:p>
-      <w:pPr>
-        <w:pStyle w:val="ListBullet"/>
-        <w:spacing w:before="0" w:after="40" w:line="264" w:lineRule="auto"/>
-      </w:pPr>
       <w:r>
-        <w:rPr>
-          <w:rFonts w:ascii="Calibri" w:hAnsi="Calibri"/>
-          <w:b w:val="0"/>
-          <w:color w:val="222222"/>
-          <w:sz w:val="19"/>
-        </w:rPr>
-        <w:t>Michael Taiwo Graduate School Application Fellowship</w:t>
+        <w:t xml:space="preserve">  *Code repositories:* github.com/Hardeezah/cdd_electron | github.com/Hardeezah/cdd-mobile</w:t>
       </w:r>
+    </w:p>
+    <w:p/>
+    <w:p>
       <w:r>
-        <w:rPr>
-          <w:rFonts w:ascii="Calibri" w:hAnsi="Calibri"/>
-          <w:b/>
-          <w:color w:val="222222"/>
-          <w:sz w:val="19"/>
-        </w:rPr>
-        <w:t xml:space="preserve"> (2026)</w:t>
+        <w:t>---</w:t>
+      </w:r>
+    </w:p>
+    <w:p/>
+    <w:p>
+      <w:r>
+        <w:t>### RESEARCH &amp; ACADEMIC EXPERIENCE</w:t>
+      </w:r>
+    </w:p>
+    <w:p/>
+    <w:p>
+      <w:r>
+        <w:t xml:space="preserve">**Department of Computer Engineering, Ahmadu Bello University**, Zaria, Nigeria  </w:t>
       </w:r>
     </w:p>
     <w:p>
-      <w:pPr>
-        <w:spacing w:before="180" w:after="60"/>
-        <w:pBdr>
-          <w:bottom w:val="single" w:sz="8" w:space="2" w:color="1A365D"/>
-        </w:pBdr>
-      </w:pPr>
       <w:r>
-        <w:rPr>
-          <w:rFonts w:ascii="Calibri" w:hAnsi="Calibri"/>
-          <w:b/>
-          <w:color w:val="1A365D"/>
-          <w:sz w:val="22"/>
-        </w:rPr>
-        <w:t>PUBLICATIONS &amp; TECHNICAL REPORTS</w:t>
+        <w:t xml:space="preserve">*Student Research Intern (SIWES)* | Apr 2024 – Dec 2024  </w:t>
       </w:r>
     </w:p>
     <w:p>
-      <w:pPr>
-        <w:pStyle w:val="ListBullet"/>
-        <w:spacing w:before="0" w:after="40" w:line="264" w:lineRule="auto"/>
-      </w:pPr>
       <w:r>
-        <w:rPr>
-          <w:rFonts w:ascii="Calibri" w:hAnsi="Calibri"/>
-          <w:b w:val="0"/>
-          <w:color w:val="222222"/>
-          <w:sz w:val="19"/>
-        </w:rPr>
-        <w:t>H. Mohammed</w:t>
-      </w:r>
-      <w:r>
-        <w:rPr>
-          <w:rFonts w:ascii="Calibri" w:hAnsi="Calibri"/>
-          <w:b/>
-          <w:color w:val="222222"/>
-          <w:sz w:val="19"/>
-        </w:rPr>
-        <w:t>, S. Ibrahim, D. L. Haruna, Z. Haruna, S. Zakari.</w:t>
-      </w:r>
-    </w:p>
-    <w:p>
-      <w:pPr>
-        <w:spacing w:before="40" w:after="40" w:line="264" w:lineRule="auto"/>
-      </w:pPr>
-      <w:r>
-        <w:rPr>
-          <w:rFonts w:ascii="Calibri" w:hAnsi="Calibri"/>
-          <w:b w:val="0"/>
-          <w:color w:val="222222"/>
-          <w:sz w:val="19"/>
-        </w:rPr>
-        <w:t>*"CropDiseaseDetector: Autonomous Multi-Modal Edge Intelligence on Ultra-Low-Power Neural Processing Units."*</w:t>
-      </w:r>
-    </w:p>
-    <w:p>
-      <w:pPr>
-        <w:spacing w:before="40" w:after="40" w:line="264" w:lineRule="auto"/>
-      </w:pPr>
-      <w:r>
-        <w:rPr>
-          <w:rFonts w:ascii="Calibri" w:hAnsi="Calibri"/>
-          <w:b w:val="0"/>
-          <w:color w:val="222222"/>
-          <w:sz w:val="19"/>
-        </w:rPr>
-        <w:t xml:space="preserve">Technical Research Report, Zenodo, 2025. </w:t>
-      </w:r>
-      <w:r>
-        <w:rPr>
-          <w:rFonts w:ascii="Calibri" w:hAnsi="Calibri"/>
-          <w:b/>
-          <w:color w:val="222222"/>
-          <w:sz w:val="19"/>
-        </w:rPr>
-        <w:t>DOI: 10.5281/zenodo.22287430</w:t>
-      </w:r>
-    </w:p>
-    <w:p>
-      <w:pPr>
-        <w:spacing w:before="40" w:after="40" w:line="264" w:lineRule="auto"/>
-      </w:pPr>
-      <w:r>
-        <w:rPr>
-          <w:rFonts w:ascii="Calibri" w:hAnsi="Calibri"/>
-          <w:b w:val="0"/>
-          <w:color w:val="222222"/>
-          <w:sz w:val="19"/>
-        </w:rPr>
-        <w:t>*Code repositories:* github.com/Hardeezah/cdd_electron | github.com/Hardeezah/cdd-mobile</w:t>
-      </w:r>
-    </w:p>
-    <w:p>
-      <w:pPr>
-        <w:spacing w:before="180" w:after="60"/>
-        <w:pBdr>
-          <w:bottom w:val="single" w:sz="8" w:space="2" w:color="1A365D"/>
-        </w:pBdr>
-      </w:pPr>
-      <w:r>
-        <w:rPr>
-          <w:rFonts w:ascii="Calibri" w:hAnsi="Calibri"/>
-          <w:b/>
-          <w:color w:val="1A365D"/>
-          <w:sz w:val="22"/>
-        </w:rPr>
-        <w:t>RESEARCH &amp; ACADEMIC EXPERIENCE</w:t>
-      </w:r>
-    </w:p>
-    <w:p>
-      <w:pPr>
-        <w:spacing w:before="40" w:after="40" w:line="264" w:lineRule="auto"/>
-      </w:pPr>
-      <w:r>
-        <w:rPr>
-          <w:rFonts w:ascii="Calibri" w:hAnsi="Calibri"/>
-          <w:b w:val="0"/>
-          <w:color w:val="222222"/>
-          <w:sz w:val="19"/>
-        </w:rPr>
-        <w:t>Department of Computer Engineering, Ahmadu Bello University</w:t>
-      </w:r>
-      <w:r>
-        <w:rPr>
-          <w:rFonts w:ascii="Calibri" w:hAnsi="Calibri"/>
-          <w:b/>
-          <w:color w:val="222222"/>
-          <w:sz w:val="19"/>
-        </w:rPr>
-        <w:t>, Zaria, Nigeria</w:t>
-      </w:r>
-    </w:p>
-    <w:p>
-      <w:pPr>
-        <w:spacing w:before="40" w:after="40" w:line="264" w:lineRule="auto"/>
-      </w:pPr>
-      <w:r>
-        <w:rPr>
-          <w:rFonts w:ascii="Calibri" w:hAnsi="Calibri"/>
-          <w:b w:val="0"/>
-          <w:color w:val="222222"/>
-          <w:sz w:val="19"/>
-        </w:rPr>
-        <w:t>*Student Research Intern (SIWES)* | Apr 2024 – Dec 2024</w:t>
-      </w:r>
-    </w:p>
-    <w:p>
-      <w:pPr>
-        <w:spacing w:before="40" w:after="40" w:line="264" w:lineRule="auto"/>
-      </w:pPr>
-      <w:r>
-        <w:rPr>
-          <w:rFonts w:ascii="Calibri" w:hAnsi="Calibri"/>
-          <w:b w:val="0"/>
-          <w:color w:val="222222"/>
-          <w:sz w:val="19"/>
-        </w:rPr>
         <w:t>*Supervised by Dr. Zaharuddeen Haruna*</w:t>
       </w:r>
     </w:p>
     <w:p>
-      <w:pPr>
-        <w:pStyle w:val="ListBullet"/>
-        <w:spacing w:before="0" w:after="40" w:line="264" w:lineRule="auto"/>
-      </w:pPr>
       <w:r>
-        <w:rPr>
-          <w:rFonts w:ascii="Calibri" w:hAnsi="Calibri"/>
-          <w:b w:val="0"/>
-          <w:color w:val="222222"/>
-          <w:sz w:val="19"/>
-        </w:rPr>
-        <w:t>Investigated optimal control and state-space estimation for nonlinear benchmark dynamical systems (ball-and-beam and ball-on-sphere models).</w:t>
+        <w:t>* Investigated optimal control and state-space estimation for nonlinear benchmark dynamical systems (ball-and-beam and ball-on-sphere models).</w:t>
       </w:r>
     </w:p>
     <w:p>
-      <w:pPr>
-        <w:pStyle w:val="ListBullet"/>
-        <w:spacing w:before="0" w:after="40" w:line="264" w:lineRule="auto"/>
-      </w:pPr>
       <w:r>
-        <w:rPr>
-          <w:rFonts w:ascii="Calibri" w:hAnsi="Calibri"/>
-          <w:b w:val="0"/>
-          <w:color w:val="222222"/>
-          <w:sz w:val="19"/>
-        </w:rPr>
-        <w:t>Formulated Linear Quadratic Regulator (LQR) control algorithms in MATLAB, simulating feedback loop stability and transient response dynamics under disturbance.</w:t>
+        <w:t>* Formulated Linear Quadratic Regulator (LQR) control algorithms in MATLAB, simulating feedback loop stability and transient response dynamics under disturbance.</w:t>
       </w:r>
     </w:p>
     <w:p>
-      <w:pPr>
-        <w:pStyle w:val="ListBullet"/>
-        <w:spacing w:before="0" w:after="40" w:line="264" w:lineRule="auto"/>
-      </w:pPr>
       <w:r>
-        <w:rPr>
-          <w:rFonts w:ascii="Calibri" w:hAnsi="Calibri"/>
-          <w:b w:val="0"/>
-          <w:color w:val="222222"/>
-          <w:sz w:val="19"/>
-        </w:rPr>
-        <w:t>Analyzed optimization techniques to bridge mathematical state estimation with low-latency embedded controller execution.</w:t>
+        <w:t>* Analyzed optimization techniques to bridge mathematical state estimation with low-latency embedded controller execution.</w:t>
       </w:r>
     </w:p>
     <w:p>
-      <w:pPr>
-        <w:pStyle w:val="ListBullet"/>
-        <w:spacing w:before="0" w:after="40" w:line="264" w:lineRule="auto"/>
-      </w:pPr>
       <w:r>
-        <w:rPr>
-          <w:rFonts w:ascii="Calibri" w:hAnsi="Calibri"/>
-          <w:b w:val="0"/>
-          <w:color w:val="222222"/>
-          <w:sz w:val="19"/>
-        </w:rPr>
-        <w:t>Supported departmental research initiatives that later transitioned into the hardware acceleration framework for project AgroGuardian.</w:t>
+        <w:t>* Supported departmental research initiatives that later transitioned into the hardware acceleration framework for project AgroGuardian.</w:t>
+      </w:r>
+    </w:p>
+    <w:p/>
+    <w:p>
+      <w:r>
+        <w:t xml:space="preserve">**Department of Computer Science, Ahmadu Bello University**, Zaria, Nigeria  </w:t>
       </w:r>
     </w:p>
     <w:p>
-      <w:pPr>
-        <w:spacing w:before="40" w:after="40" w:line="264" w:lineRule="auto"/>
-      </w:pPr>
       <w:r>
-        <w:rPr>
-          <w:rFonts w:ascii="Calibri" w:hAnsi="Calibri"/>
-          <w:b w:val="0"/>
-          <w:color w:val="222222"/>
-          <w:sz w:val="19"/>
-        </w:rPr>
-        <w:t>Department of Computer Science, Ahmadu Bello University</w:t>
-      </w:r>
-      <w:r>
-        <w:rPr>
-          <w:rFonts w:ascii="Calibri" w:hAnsi="Calibri"/>
-          <w:b/>
-          <w:color w:val="222222"/>
-          <w:sz w:val="19"/>
-        </w:rPr>
-        <w:t>, Zaria, Nigeria</w:t>
+        <w:t xml:space="preserve">*Undergraduate Research Assistant (Knowledge Representation)* | Sep 2024 – Oct 2024  </w:t>
       </w:r>
     </w:p>
     <w:p>
-      <w:pPr>
-        <w:spacing w:before="40" w:after="40" w:line="264" w:lineRule="auto"/>
-      </w:pPr>
       <w:r>
-        <w:rPr>
-          <w:rFonts w:ascii="Calibri" w:hAnsi="Calibri"/>
-          <w:b w:val="0"/>
-          <w:color w:val="222222"/>
-          <w:sz w:val="19"/>
-        </w:rPr>
-        <w:t>*Undergraduate Research Assistant (Knowledge Representation)* | Sep 2024 – Oct 2024</w:t>
-      </w:r>
-    </w:p>
-    <w:p>
-      <w:pPr>
-        <w:spacing w:before="40" w:after="40" w:line="264" w:lineRule="auto"/>
-      </w:pPr>
-      <w:r>
-        <w:rPr>
-          <w:rFonts w:ascii="Calibri" w:hAnsi="Calibri"/>
-          <w:b w:val="0"/>
-          <w:color w:val="222222"/>
-          <w:sz w:val="19"/>
-        </w:rPr>
         <w:t>*Supervised by Dr. Salisu Aliyu*</w:t>
       </w:r>
     </w:p>
     <w:p>
-      <w:pPr>
-        <w:pStyle w:val="ListBullet"/>
-        <w:spacing w:before="0" w:after="40" w:line="264" w:lineRule="auto"/>
-      </w:pPr>
       <w:r>
-        <w:rPr>
-          <w:rFonts w:ascii="Calibri" w:hAnsi="Calibri"/>
-          <w:b w:val="0"/>
-          <w:color w:val="222222"/>
-          <w:sz w:val="19"/>
-        </w:rPr>
-        <w:t>Researched structured knowledge representation paradigms to ground non-parametric neural network inference within formal domain ontologies.</w:t>
+        <w:t>* Researched structured knowledge representation paradigms to ground non-parametric neural network inference within formal domain ontologies.</w:t>
       </w:r>
     </w:p>
     <w:p>
-      <w:pPr>
-        <w:pStyle w:val="ListBullet"/>
-        <w:spacing w:before="0" w:after="40" w:line="264" w:lineRule="auto"/>
-      </w:pPr>
       <w:r>
-        <w:rPr>
-          <w:rFonts w:ascii="Calibri" w:hAnsi="Calibri"/>
-          <w:b w:val="0"/>
-          <w:color w:val="222222"/>
-          <w:sz w:val="19"/>
-        </w:rPr>
-        <w:t>Investigated semantic graph indexing and vector retrieval schemas to eliminate hallucination in domain-specific inference.</w:t>
+        <w:t>* Investigated semantic graph indexing and vector retrieval schemas to eliminate hallucination in domain-specific inference.</w:t>
       </w:r>
     </w:p>
     <w:p>
-      <w:pPr>
-        <w:pStyle w:val="ListBullet"/>
-        <w:spacing w:before="0" w:after="40" w:line="264" w:lineRule="auto"/>
-      </w:pPr>
       <w:r>
-        <w:rPr>
-          <w:rFonts w:ascii="Calibri" w:hAnsi="Calibri"/>
-          <w:b w:val="0"/>
-          <w:color w:val="222222"/>
-          <w:sz w:val="19"/>
-        </w:rPr>
-        <w:t>Established the structural foundations for subsequent retrieval-augmented architectures deployed in cross-border trade compliance models.</w:t>
+        <w:t>* Established the structural foundations for subsequent retrieval-augmented architectures deployed in cross-border trade compliance models.</w:t>
+      </w:r>
+    </w:p>
+    <w:p/>
+    <w:p>
+      <w:r>
+        <w:t>---</w:t>
+      </w:r>
+    </w:p>
+    <w:p/>
+    <w:p>
+      <w:r>
+        <w:t>### FLAGSHIP SYSTEMS &amp; RESEARCH PROJECTS</w:t>
+      </w:r>
+    </w:p>
+    <w:p/>
+    <w:p>
+      <w:r>
+        <w:t xml:space="preserve">**AgroGuardian / CropDiseaseDetector — Autonomous Multi-Modal Edge Intelligence Platform** (2024–2026)  </w:t>
       </w:r>
     </w:p>
     <w:p>
-      <w:pPr>
-        <w:spacing w:before="180" w:after="60"/>
-        <w:pBdr>
-          <w:bottom w:val="single" w:sz="8" w:space="2" w:color="1A365D"/>
-        </w:pBdr>
-      </w:pPr>
       <w:r>
-        <w:rPr>
-          <w:rFonts w:ascii="Calibri" w:hAnsi="Calibri"/>
-          <w:b/>
-          <w:color w:val="1A365D"/>
-          <w:sz w:val="22"/>
-        </w:rPr>
-        <w:t>FLAGSHIP SYSTEMS &amp; RESEARCH PROJECTS</w:t>
-      </w:r>
-    </w:p>
-    <w:p>
-      <w:pPr>
-        <w:spacing w:before="40" w:after="40" w:line="264" w:lineRule="auto"/>
-      </w:pPr>
-      <w:r>
-        <w:rPr>
-          <w:rFonts w:ascii="Calibri" w:hAnsi="Calibri"/>
-          <w:b w:val="0"/>
-          <w:color w:val="222222"/>
-          <w:sz w:val="19"/>
-        </w:rPr>
-        <w:t>AgroGuardian / CropDiseaseDetector — Autonomous Multi-Modal Edge Intelligence Platform</w:t>
-      </w:r>
-      <w:r>
-        <w:rPr>
-          <w:rFonts w:ascii="Calibri" w:hAnsi="Calibri"/>
-          <w:b/>
-          <w:color w:val="222222"/>
-          <w:sz w:val="19"/>
-        </w:rPr>
-        <w:t xml:space="preserve"> (2024–2026)</w:t>
-      </w:r>
-    </w:p>
-    <w:p>
-      <w:pPr>
-        <w:spacing w:before="40" w:after="40" w:line="264" w:lineRule="auto"/>
-      </w:pPr>
-      <w:r>
-        <w:rPr>
-          <w:rFonts w:ascii="Calibri" w:hAnsi="Calibri"/>
-          <w:b w:val="0"/>
-          <w:color w:val="222222"/>
-          <w:sz w:val="19"/>
-        </w:rPr>
         <w:t>*Team Lead &amp; Systems Architect | Supervised by Dr. Z. Haruna and Mrs. S. Zakari*</w:t>
       </w:r>
     </w:p>
     <w:p>
-      <w:pPr>
-        <w:pStyle w:val="ListBullet"/>
-        <w:spacing w:before="0" w:after="40" w:line="264" w:lineRule="auto"/>
-      </w:pPr>
       <w:r>
-        <w:rPr>
-          <w:rFonts w:ascii="Calibri" w:hAnsi="Calibri"/>
-          <w:b w:val="0"/>
-          <w:color w:val="222222"/>
-          <w:sz w:val="19"/>
-        </w:rPr>
-        <w:t>Engineered an end-to-end autonomous edge AI diagnostic device deployed on an Orange Pi AIpro 20T powered by a Huawei Ascend 310B NPU running OpenEuler OS.</w:t>
+        <w:t>* Engineered an end-to-end autonomous edge AI diagnostic device deployed on an Orange Pi AIpro 20T powered by a Huawei Ascend 310B NPU running OpenEuler OS.</w:t>
       </w:r>
     </w:p>
     <w:p>
-      <w:pPr>
-        <w:pStyle w:val="ListBullet"/>
-        <w:spacing w:before="0" w:after="40" w:line="264" w:lineRule="auto"/>
-      </w:pPr>
       <w:r>
-        <w:rPr>
-          <w:rFonts w:ascii="Calibri" w:hAnsi="Calibri"/>
-          <w:b w:val="0"/>
-          <w:color w:val="222222"/>
-          <w:sz w:val="19"/>
-        </w:rPr>
-        <w:t>Trained a 46-class MobileNetV2 vision backbone across ten agricultural crops using SMOTE to correct extreme class imbalances; achieved 98.2% accuracy on held-out evaluation datasets.</w:t>
+        <w:t>* Trained a 46-class MobileNetV2 vision backbone across ten agricultural crops using SMOTE to correct extreme class imbalances; achieved 98.2% accuracy on held-out evaluation datasets.</w:t>
       </w:r>
     </w:p>
     <w:p>
-      <w:pPr>
-        <w:pStyle w:val="ListBullet"/>
-        <w:spacing w:before="0" w:after="40" w:line="264" w:lineRule="auto"/>
-      </w:pPr>
       <w:r>
-        <w:rPr>
-          <w:rFonts w:ascii="Calibri" w:hAnsi="Calibri"/>
-          <w:b w:val="0"/>
-          <w:color w:val="222222"/>
-          <w:sz w:val="19"/>
-        </w:rPr>
-        <w:t>Implemented a concurrent YOLOv8n video detector pipeline for real-time leaf localization and bounding-box inference under unstructured outdoor lighting.</w:t>
+        <w:t>* Implemented a concurrent YOLOv8n video detector pipeline for real-time leaf localization and bounding-box inference under unstructured outdoor lighting.</w:t>
       </w:r>
     </w:p>
     <w:p>
-      <w:pPr>
-        <w:pStyle w:val="ListBullet"/>
-        <w:spacing w:before="0" w:after="40" w:line="264" w:lineRule="auto"/>
-      </w:pPr>
       <w:r>
-        <w:rPr>
-          <w:rFonts w:ascii="Calibri" w:hAnsi="Calibri"/>
-          <w:b w:val="0"/>
-          <w:color w:val="222222"/>
-          <w:sz w:val="19"/>
-        </w:rPr>
-        <w:t>Integrated localized multi-sensor fusion: coupled a 7-in-1 NPK soil probe with localized Random Forest inference to provide immediate soil chemistry diagnostics without cloud connectivity.</w:t>
+        <w:t>* Integrated localized multi-sensor fusion: coupled a 7-in-1 NPK soil probe with localized Random Forest inference to provide immediate soil chemistry diagnostics without cloud connectivity.</w:t>
       </w:r>
     </w:p>
     <w:p>
-      <w:pPr>
-        <w:pStyle w:val="ListBullet"/>
-        <w:spacing w:before="0" w:after="40" w:line="264" w:lineRule="auto"/>
-      </w:pPr>
       <w:r>
-        <w:rPr>
-          <w:rFonts w:ascii="Calibri" w:hAnsi="Calibri"/>
-          <w:b w:val="0"/>
-          <w:color w:val="222222"/>
-          <w:sz w:val="19"/>
-        </w:rPr>
-        <w:t>Resolved critical edge systems bottlenecks: managed memory access patterns and zero-copy buffers in the Ascend CANN toolchain, avoiding thermal throttling and sustaining sub-watt power performance.</w:t>
+        <w:t>* Resolved critical edge systems bottlenecks: managed memory access patterns and zero-copy buffers in the Ascend CANN toolchain, avoiding thermal throttling and sustaining sub-watt power performance.</w:t>
       </w:r>
     </w:p>
     <w:p>
-      <w:pPr>
-        <w:pStyle w:val="ListBullet"/>
-        <w:spacing w:before="0" w:after="40" w:line="264" w:lineRule="auto"/>
-      </w:pPr>
       <w:r>
-        <w:rPr>
-          <w:rFonts w:ascii="Calibri" w:hAnsi="Calibri"/>
-          <w:b w:val="0"/>
-          <w:color w:val="222222"/>
-          <w:sz w:val="19"/>
-        </w:rPr>
-        <w:t>Designed an offline-first data synchronization engine using SQLite with write-ahead logging (WAL) that automatically reconciles with PostgreSQL upon detecting network handshakes.</w:t>
+        <w:t>* Designed an offline-first data synchronization engine using SQLite with write-ahead logging (WAL) that automatically reconciles with PostgreSQL upon detecting network handshakes.</w:t>
+      </w:r>
+    </w:p>
+    <w:p/>
+    <w:p>
+      <w:r>
+        <w:t xml:space="preserve">**DocDrift — Static Analysis &amp; Documentation Drift Verification System** (2025)  </w:t>
       </w:r>
     </w:p>
     <w:p>
-      <w:pPr>
-        <w:spacing w:before="40" w:after="40" w:line="264" w:lineRule="auto"/>
-      </w:pPr>
       <w:r>
-        <w:rPr>
-          <w:rFonts w:ascii="Calibri" w:hAnsi="Calibri"/>
-          <w:b w:val="0"/>
-          <w:color w:val="222222"/>
-          <w:sz w:val="19"/>
-        </w:rPr>
-        <w:t>DocDrift — Static Analysis &amp; Documentation Drift Verification System</w:t>
-      </w:r>
-      <w:r>
-        <w:rPr>
-          <w:rFonts w:ascii="Calibri" w:hAnsi="Calibri"/>
-          <w:b/>
-          <w:color w:val="222222"/>
-          <w:sz w:val="19"/>
-        </w:rPr>
-        <w:t xml:space="preserve"> (2025)</w:t>
-      </w:r>
-    </w:p>
-    <w:p>
-      <w:pPr>
-        <w:spacing w:before="40" w:after="40" w:line="264" w:lineRule="auto"/>
-      </w:pPr>
-      <w:r>
-        <w:rPr>
-          <w:rFonts w:ascii="Calibri" w:hAnsi="Calibri"/>
-          <w:b w:val="0"/>
-          <w:color w:val="222222"/>
-          <w:sz w:val="19"/>
-        </w:rPr>
         <w:t>*Independent Systems Project*</w:t>
       </w:r>
     </w:p>
     <w:p>
-      <w:pPr>
-        <w:pStyle w:val="ListBullet"/>
-        <w:spacing w:before="0" w:after="40" w:line="264" w:lineRule="auto"/>
-      </w:pPr>
       <w:r>
-        <w:rPr>
-          <w:rFonts w:ascii="Calibri" w:hAnsi="Calibri"/>
-          <w:b w:val="0"/>
-          <w:color w:val="222222"/>
-          <w:sz w:val="19"/>
-        </w:rPr>
-        <w:t>Developed an automated code-analysis agent utilizing LangGraph to identify semantic divergence between evolving TypeScript/Python codebases and documentation claims.</w:t>
+        <w:t>* Developed an automated code-analysis agent utilizing LangGraph to identify semantic divergence between evolving TypeScript/Python codebases and documentation claims.</w:t>
       </w:r>
     </w:p>
     <w:p>
-      <w:pPr>
-        <w:pStyle w:val="ListBullet"/>
-        <w:spacing w:before="0" w:after="40" w:line="264" w:lineRule="auto"/>
-      </w:pPr>
       <w:r>
-        <w:rPr>
-          <w:rFonts w:ascii="Calibri" w:hAnsi="Calibri"/>
-          <w:b w:val="0"/>
-          <w:color w:val="222222"/>
-          <w:sz w:val="19"/>
-        </w:rPr>
-        <w:t>Constructed a precision-gated evaluation pipeline combining abstract syntax tree (AST) traversal with local dense embedding search via Ollama, ensuring zero telemetry leakage.</w:t>
+        <w:t>* Constructed a precision-gated evaluation pipeline combining abstract syntax tree (AST) traversal with local dense embedding search via Ollama, ensuring zero telemetry leakage.</w:t>
       </w:r>
     </w:p>
     <w:p>
-      <w:pPr>
-        <w:pStyle w:val="ListBullet"/>
-        <w:spacing w:before="0" w:after="40" w:line="264" w:lineRule="auto"/>
-      </w:pPr>
       <w:r>
-        <w:rPr>
-          <w:rFonts w:ascii="Calibri" w:hAnsi="Calibri"/>
-          <w:b w:val="0"/>
-          <w:color w:val="222222"/>
-          <w:sz w:val="19"/>
-        </w:rPr>
-        <w:t>Packaged as an open-source CLI and GitHub Action, enabling continuous semantic testing within automated CI/CD pipelines.</w:t>
+        <w:t>* Packaged as an open-source CLI and GitHub Action, enabling continuous semantic testing within automated CI/CD pipelines.</w:t>
+      </w:r>
+    </w:p>
+    <w:p/>
+    <w:p>
+      <w:r>
+        <w:t xml:space="preserve">**Omni-Agent — Multi-Agent Hybrid Retrieval-Augmented System** (2025)  </w:t>
       </w:r>
     </w:p>
     <w:p>
-      <w:pPr>
-        <w:spacing w:before="40" w:after="40" w:line="264" w:lineRule="auto"/>
-      </w:pPr>
       <w:r>
-        <w:rPr>
-          <w:rFonts w:ascii="Calibri" w:hAnsi="Calibri"/>
-          <w:b w:val="0"/>
-          <w:color w:val="222222"/>
-          <w:sz w:val="19"/>
-        </w:rPr>
-        <w:t>Omni-Agent — Multi-Agent Hybrid Retrieval-Augmented System</w:t>
-      </w:r>
-      <w:r>
-        <w:rPr>
-          <w:rFonts w:ascii="Calibri" w:hAnsi="Calibri"/>
-          <w:b/>
-          <w:color w:val="222222"/>
-          <w:sz w:val="19"/>
-        </w:rPr>
-        <w:t xml:space="preserve"> (2025)</w:t>
-      </w:r>
-    </w:p>
-    <w:p>
-      <w:pPr>
-        <w:spacing w:before="40" w:after="40" w:line="264" w:lineRule="auto"/>
-      </w:pPr>
-      <w:r>
-        <w:rPr>
-          <w:rFonts w:ascii="Calibri" w:hAnsi="Calibri"/>
-          <w:b w:val="0"/>
-          <w:color w:val="222222"/>
-          <w:sz w:val="19"/>
-        </w:rPr>
         <w:t>*Independent Research Project*</w:t>
       </w:r>
     </w:p>
     <w:p>
-      <w:pPr>
-        <w:pStyle w:val="ListBullet"/>
-        <w:spacing w:before="0" w:after="40" w:line="264" w:lineRule="auto"/>
-      </w:pPr>
       <w:r>
-        <w:rPr>
-          <w:rFonts w:ascii="Calibri" w:hAnsi="Calibri"/>
-          <w:b w:val="0"/>
-          <w:color w:val="222222"/>
-          <w:sz w:val="19"/>
-        </w:rPr>
-        <w:t>Architected a multi-agent financial document retrieval engine deploying specialized Researcher and Critic agents over dense SEC filing corpora.</w:t>
+        <w:t>* Architected a multi-agent financial document retrieval engine deploying specialized Researcher and Critic agents over dense SEC filing corpora.</w:t>
       </w:r>
     </w:p>
     <w:p>
-      <w:pPr>
-        <w:pStyle w:val="ListBullet"/>
-        <w:spacing w:before="0" w:after="40" w:line="264" w:lineRule="auto"/>
-      </w:pPr>
       <w:r>
-        <w:rPr>
-          <w:rFonts w:ascii="Calibri" w:hAnsi="Calibri"/>
-          <w:b w:val="0"/>
-          <w:color w:val="222222"/>
-          <w:sz w:val="19"/>
-        </w:rPr>
-        <w:t>Built a hybrid lexical-dense retrieval pipeline fusing BM25 scores with cross-encoder re-ranking to maximize mean reciprocal rank (MRR).</w:t>
+        <w:t>* Built a hybrid lexical-dense retrieval pipeline fusing BM25 scores with cross-encoder re-ranking to maximize mean reciprocal rank (MRR).</w:t>
       </w:r>
     </w:p>
     <w:p>
-      <w:pPr>
-        <w:pStyle w:val="ListBullet"/>
-        <w:spacing w:before="0" w:after="40" w:line="264" w:lineRule="auto"/>
-      </w:pPr>
       <w:r>
-        <w:rPr>
-          <w:rFonts w:ascii="Calibri" w:hAnsi="Calibri"/>
-          <w:b w:val="0"/>
-          <w:color w:val="222222"/>
-          <w:sz w:val="19"/>
-        </w:rPr>
-        <w:t>Implemented a self-corrective query rewriting loop and instrumented an automated RAGAS benchmark evaluating answer faithfulness, context precision, and semantic recall.</w:t>
+        <w:t>* Implemented a self-corrective query rewriting loop and instrumented an automated RAGAS benchmark evaluating answer faithfulness, context precision, and semantic recall.</w:t>
+      </w:r>
+    </w:p>
+    <w:p/>
+    <w:p>
+      <w:r>
+        <w:t>---</w:t>
+      </w:r>
+    </w:p>
+    <w:p/>
+    <w:p>
+      <w:r>
+        <w:t>### PROFESSIONAL &amp; SYSTEMS ENGINEERING EXPERIENCE</w:t>
+      </w:r>
+    </w:p>
+    <w:p/>
+    <w:p>
+      <w:r>
+        <w:t>**Koda (AfCFTA AI Trade Compliance)** | *Founding Systems &amp; AI Engineer* | Jan 2025 – Apr 2026</w:t>
       </w:r>
     </w:p>
     <w:p>
-      <w:pPr>
-        <w:spacing w:before="180" w:after="60"/>
-        <w:pBdr>
-          <w:bottom w:val="single" w:sz="8" w:space="2" w:color="1A365D"/>
-        </w:pBdr>
-      </w:pPr>
       <w:r>
-        <w:rPr>
-          <w:rFonts w:ascii="Calibri" w:hAnsi="Calibri"/>
-          <w:b/>
-          <w:color w:val="1A365D"/>
-          <w:sz w:val="22"/>
-        </w:rPr>
-        <w:t>PROFESSIONAL &amp; SYSTEMS ENGINEERING EXPERIENCE</w:t>
+        <w:t>* Architected a high-throughput regulatory intelligence pipeline utilizing FastAPI, pgvector, Redis, and PostgreSQL to parse complex AfCFTA, CBN, and NAFDAC trade compliance statutes.</w:t>
       </w:r>
     </w:p>
     <w:p>
-      <w:pPr>
-        <w:spacing w:before="40" w:after="40" w:line="264" w:lineRule="auto"/>
-      </w:pPr>
       <w:r>
-        <w:rPr>
-          <w:rFonts w:ascii="Calibri" w:hAnsi="Calibri"/>
-          <w:b w:val="0"/>
-          <w:color w:val="222222"/>
-          <w:sz w:val="19"/>
-        </w:rPr>
-        <w:t>Koda (AfCFTA AI Trade Compliance)</w:t>
-      </w:r>
-      <w:r>
-        <w:rPr>
-          <w:rFonts w:ascii="Calibri" w:hAnsi="Calibri"/>
-          <w:b/>
-          <w:color w:val="222222"/>
-          <w:sz w:val="19"/>
-        </w:rPr>
-        <w:t xml:space="preserve"> | *Founding Systems &amp; AI Engineer* | Jan 2025 – Apr 2026</w:t>
+        <w:t>* Engineered a dual-stage vision-language classification model mapping raw product imagery to statutory 6-digit Harmonized System (HS) codes.</w:t>
       </w:r>
     </w:p>
     <w:p>
-      <w:pPr>
-        <w:pStyle w:val="ListBullet"/>
-        <w:spacing w:before="0" w:after="40" w:line="264" w:lineRule="auto"/>
-      </w:pPr>
       <w:r>
-        <w:rPr>
-          <w:rFonts w:ascii="Calibri" w:hAnsi="Calibri"/>
-          <w:b w:val="0"/>
-          <w:color w:val="222222"/>
-          <w:sz w:val="19"/>
-        </w:rPr>
-        <w:t>Architected a high-throughput regulatory intelligence pipeline utilizing FastAPI, pgvector, Redis, and PostgreSQL to parse complex AfCFTA, CBN, and NAFDAC trade compliance statutes.</w:t>
+        <w:t>* Presented the compliance platform at the **UNITAR Japan-Africa Public-Private Partnership Forum under TICAD9**, highlighting decentralized AI deployment for Sub-Saharan SMEs.</w:t>
+      </w:r>
+    </w:p>
+    <w:p/>
+    <w:p>
+      <w:r>
+        <w:t>**GymPal &amp; K33P Systems** | *Backend &amp; Distributed Systems Engineer* | Jan 2025 – Present</w:t>
       </w:r>
     </w:p>
     <w:p>
-      <w:pPr>
-        <w:pStyle w:val="ListBullet"/>
-        <w:spacing w:before="0" w:after="40" w:line="264" w:lineRule="auto"/>
-      </w:pPr>
       <w:r>
-        <w:rPr>
-          <w:rFonts w:ascii="Calibri" w:hAnsi="Calibri"/>
-          <w:b w:val="0"/>
-          <w:color w:val="222222"/>
-          <w:sz w:val="19"/>
-        </w:rPr>
-        <w:t>Engineered a dual-stage vision-language classification model mapping raw product imagery to statutory 6-digit Harmonized System (HS) codes.</w:t>
+        <w:t>* Designed low-latency real-time streaming backend infrastructure in TypeScript, NestJS, Prisma, and PostgreSQL supporting concurrent bidirectional WebSocket channels.</w:t>
       </w:r>
     </w:p>
     <w:p>
-      <w:pPr>
-        <w:pStyle w:val="ListBullet"/>
-        <w:spacing w:before="0" w:after="40" w:line="264" w:lineRule="auto"/>
-      </w:pPr>
       <w:r>
-        <w:rPr>
-          <w:rFonts w:ascii="Calibri" w:hAnsi="Calibri"/>
-          <w:b w:val="0"/>
-          <w:color w:val="222222"/>
-          <w:sz w:val="19"/>
-        </w:rPr>
-        <w:t xml:space="preserve">Presented the compliance platform at the </w:t>
+        <w:t>* Implemented distributed state caching, event-driven message queuing, and asynchronous transaction validation pipelines handling high-throughput telemetry.</w:t>
       </w:r>
+    </w:p>
+    <w:p/>
+    <w:p>
       <w:r>
-        <w:rPr>
-          <w:rFonts w:ascii="Calibri" w:hAnsi="Calibri"/>
-          <w:b/>
-          <w:color w:val="222222"/>
-          <w:sz w:val="19"/>
-        </w:rPr>
-        <w:t>UNITAR Japan-Africa Public-Private Partnership Forum under TICAD9</w:t>
+        <w:t>---</w:t>
       </w:r>
+    </w:p>
+    <w:p/>
+    <w:p>
       <w:r>
-        <w:rPr>
-          <w:rFonts w:ascii="Calibri" w:hAnsi="Calibri"/>
-          <w:b w:val="0"/>
-          <w:color w:val="222222"/>
-          <w:sz w:val="19"/>
-        </w:rPr>
-        <w:t>, highlighting decentralized AI deployment for Sub-Saharan SMEs.</w:t>
+        <w:t>### CONFERENCES &amp; INVITED PRESENTATIONS</w:t>
+      </w:r>
+    </w:p>
+    <w:p/>
+    <w:p>
+      <w:r>
+        <w:t>* **UNITAR Forum on Japan–Africa Public-Private Partnership (TICAD9)** — Presented Koda AI Trade Infrastructure, Tokyo/Virtual (2025).</w:t>
       </w:r>
     </w:p>
     <w:p>
-      <w:pPr>
-        <w:spacing w:before="40" w:after="40" w:line="264" w:lineRule="auto"/>
-      </w:pPr>
       <w:r>
-        <w:rPr>
-          <w:rFonts w:ascii="Calibri" w:hAnsi="Calibri"/>
-          <w:b w:val="0"/>
-          <w:color w:val="222222"/>
-          <w:sz w:val="19"/>
-        </w:rPr>
-        <w:t>GymPal &amp; K33P Systems</w:t>
-      </w:r>
-      <w:r>
-        <w:rPr>
-          <w:rFonts w:ascii="Calibri" w:hAnsi="Calibri"/>
-          <w:b/>
-          <w:color w:val="222222"/>
-          <w:sz w:val="19"/>
-        </w:rPr>
-        <w:t xml:space="preserve"> | *Backend &amp; Distributed Systems Engineer* | Jan 2025 – Present</w:t>
+        <w:t>* **VI International Scientific &amp; Practical Conference**, Kyiv National University of Technologies and Design — Presented Edge AI Deployment in Emerging Agriculture (Apr 2025).</w:t>
       </w:r>
     </w:p>
     <w:p>
-      <w:pPr>
-        <w:pStyle w:val="ListBullet"/>
-        <w:spacing w:before="0" w:after="40" w:line="264" w:lineRule="auto"/>
-      </w:pPr>
       <w:r>
-        <w:rPr>
-          <w:rFonts w:ascii="Calibri" w:hAnsi="Calibri"/>
-          <w:b w:val="0"/>
-          <w:color w:val="222222"/>
-          <w:sz w:val="19"/>
-        </w:rPr>
-        <w:t>Designed low-latency real-time streaming backend infrastructure in TypeScript, NestJS, Prisma, and PostgreSQL supporting concurrent bidirectional WebSocket channels.</w:t>
+        <w:t>* **Huawei Global ICT Leadership Summit** — Invited Delegate representing Nigeria, Shenzhen, China (Nov 2024).</w:t>
+      </w:r>
+    </w:p>
+    <w:p/>
+    <w:p>
+      <w:r>
+        <w:t>---</w:t>
+      </w:r>
+    </w:p>
+    <w:p/>
+    <w:p>
+      <w:r>
+        <w:t>### TECHNICAL SKILLS</w:t>
+      </w:r>
+    </w:p>
+    <w:p/>
+    <w:p>
+      <w:r>
+        <w:t>* **Machine Learning &amp; Edge Systems:** TinyML, Deep Compression, Model Quantization (INT8), Neural Architecture Search, MobileNetV2, YOLO, PyTorch, TensorFlow Lite, Ascend CANN Toolkit, OpenCV, RAGAS, Ollama.</w:t>
       </w:r>
     </w:p>
     <w:p>
-      <w:pPr>
-        <w:pStyle w:val="ListBullet"/>
-        <w:spacing w:before="0" w:after="40" w:line="264" w:lineRule="auto"/>
-      </w:pPr>
       <w:r>
-        <w:rPr>
-          <w:rFonts w:ascii="Calibri" w:hAnsi="Calibri"/>
-          <w:b w:val="0"/>
-          <w:color w:val="222222"/>
-          <w:sz w:val="19"/>
-        </w:rPr>
-        <w:t>Implemented distributed state caching, event-driven message queuing, and asynchronous transaction validation pipelines handling high-throughput telemetry.</w:t>
+        <w:t>* **Systems &amp; Programming Languages:** Python, C/C++, TypeScript, JavaScript, SQL, MATLAB, Bash.</w:t>
       </w:r>
     </w:p>
     <w:p>
-      <w:pPr>
-        <w:spacing w:before="180" w:after="60"/>
-        <w:pBdr>
-          <w:bottom w:val="single" w:sz="8" w:space="2" w:color="1A365D"/>
-        </w:pBdr>
-      </w:pPr>
       <w:r>
-        <w:rPr>
-          <w:rFonts w:ascii="Calibri" w:hAnsi="Calibri"/>
-          <w:b/>
-          <w:color w:val="1A365D"/>
-          <w:sz w:val="22"/>
-        </w:rPr>
-        <w:t>CONFERENCES &amp; INVITED PRESENTATIONS</w:t>
+        <w:t>* **Operating Systems &amp; Infrastructure:** Linux / OpenEuler, Embedded NPU Toolchains, Docker, Kubernetes, Git, GitHub Actions.</w:t>
       </w:r>
     </w:p>
     <w:p>
-      <w:pPr>
-        <w:pStyle w:val="ListBullet"/>
-        <w:spacing w:before="0" w:after="40" w:line="264" w:lineRule="auto"/>
-      </w:pPr>
       <w:r>
-        <w:rPr>
-          <w:rFonts w:ascii="Calibri" w:hAnsi="Calibri"/>
-          <w:b w:val="0"/>
-          <w:color w:val="222222"/>
-          <w:sz w:val="19"/>
-        </w:rPr>
-        <w:t>UNITAR Forum on Japan–Africa Public-Private Partnership (TICAD9)</w:t>
+        <w:t>* **Databases &amp; Data Systems:** PostgreSQL, pgvector, SQLite (WAL mode), Redis, Supabase, Qdrant.</w:t>
       </w:r>
+    </w:p>
+    <w:p/>
+    <w:p>
       <w:r>
-        <w:rPr>
-          <w:rFonts w:ascii="Calibri" w:hAnsi="Calibri"/>
-          <w:b/>
-          <w:color w:val="222222"/>
-          <w:sz w:val="19"/>
-        </w:rPr>
-        <w:t xml:space="preserve"> — Presented Koda AI Trade Infrastructure, Tokyo/Virtual (2025).</w:t>
+        <w:t>---</w:t>
+      </w:r>
+    </w:p>
+    <w:p/>
+    <w:p>
+      <w:r>
+        <w:t>### ACADEMIC REFERENCES</w:t>
+      </w:r>
+    </w:p>
+    <w:p/>
+    <w:p>
+      <w:r>
+        <w:t xml:space="preserve">* **Dr. Armand Florentin Donfack Kana**  </w:t>
       </w:r>
     </w:p>
     <w:p>
-      <w:pPr>
-        <w:pStyle w:val="ListBullet"/>
-        <w:spacing w:before="0" w:after="40" w:line="264" w:lineRule="auto"/>
-      </w:pPr>
       <w:r>
-        <w:rPr>
-          <w:rFonts w:ascii="Calibri" w:hAnsi="Calibri"/>
-          <w:b w:val="0"/>
-          <w:color w:val="222222"/>
-          <w:sz w:val="19"/>
-        </w:rPr>
-        <w:t>VI International Scientific &amp; Practical Conference</w:t>
-      </w:r>
-      <w:r>
-        <w:rPr>
-          <w:rFonts w:ascii="Calibri" w:hAnsi="Calibri"/>
-          <w:b/>
-          <w:color w:val="222222"/>
-          <w:sz w:val="19"/>
-        </w:rPr>
-        <w:t>, Kyiv National University of Technologies and Design — Presented Edge AI Deployment in Emerging Agriculture (Apr 2025).</w:t>
+        <w:t xml:space="preserve">  *Senior Lecturer, Department of Computer Science*, Ahmadu Bello University, Zaria, Nigeria  </w:t>
       </w:r>
     </w:p>
     <w:p>
-      <w:pPr>
-        <w:pStyle w:val="ListBullet"/>
-        <w:spacing w:before="0" w:after="40" w:line="264" w:lineRule="auto"/>
-      </w:pPr>
       <w:r>
-        <w:rPr>
-          <w:rFonts w:ascii="Calibri" w:hAnsi="Calibri"/>
-          <w:b w:val="0"/>
-          <w:color w:val="222222"/>
-          <w:sz w:val="19"/>
-        </w:rPr>
-        <w:t>Huawei Global ICT Leadership Summit</w:t>
+        <w:t xml:space="preserve">  Emails: `dkana@abu.edu.ng` | `dkana@mit.edu`</w:t>
       </w:r>
+    </w:p>
+    <w:p/>
+    <w:p>
       <w:r>
-        <w:rPr>
-          <w:rFonts w:ascii="Calibri" w:hAnsi="Calibri"/>
-          <w:b/>
-          <w:color w:val="222222"/>
-          <w:sz w:val="19"/>
-        </w:rPr>
-        <w:t xml:space="preserve"> — Invited Delegate representing Nigeria, Shenzhen, China (Nov 2024).</w:t>
+        <w:t xml:space="preserve">* **Dr. Mohammed Abdullahi**  </w:t>
       </w:r>
     </w:p>
     <w:p>
-      <w:pPr>
-        <w:spacing w:before="180" w:after="60"/>
-        <w:pBdr>
-          <w:bottom w:val="single" w:sz="8" w:space="2" w:color="1A365D"/>
-        </w:pBdr>
-      </w:pPr>
       <w:r>
-        <w:rPr>
-          <w:rFonts w:ascii="Calibri" w:hAnsi="Calibri"/>
-          <w:b/>
-          <w:color w:val="1A365D"/>
-          <w:sz w:val="22"/>
-        </w:rPr>
-        <w:t>TECHNICAL SKILLS</w:t>
+        <w:t xml:space="preserve">  *Senior Lecturer, Department of Computer Science*, Ahmadu Bello University, Zaria, Nigeria  </w:t>
       </w:r>
     </w:p>
     <w:p>
-      <w:pPr>
-        <w:pStyle w:val="ListBullet"/>
-        <w:spacing w:before="0" w:after="40" w:line="264" w:lineRule="auto"/>
-      </w:pPr>
       <w:r>
-        <w:rPr>
-          <w:rFonts w:ascii="Calibri" w:hAnsi="Calibri"/>
-          <w:b w:val="0"/>
-          <w:color w:val="222222"/>
-          <w:sz w:val="19"/>
-        </w:rPr>
-        <w:t>Machine Learning &amp; Edge Systems:</w:t>
+        <w:t xml:space="preserve">  Email: `abdullahilwafu@abu.edu.ng`</w:t>
       </w:r>
+    </w:p>
+    <w:p/>
+    <w:p>
       <w:r>
-        <w:rPr>
-          <w:rFonts w:ascii="Calibri" w:hAnsi="Calibri"/>
-          <w:b/>
-          <w:color w:val="222222"/>
-          <w:sz w:val="19"/>
-        </w:rPr>
-        <w:t xml:space="preserve"> TinyML, Deep Compression, Model Quantization (INT8), Neural Architecture Search, MobileNetV2, YOLO, PyTorch, TensorFlow Lite, Ascend CANN Toolkit, OpenCV, RAGAS, Ollama.</w:t>
+        <w:t xml:space="preserve">* **Dr. Zaharuddeen Haruna**  </w:t>
       </w:r>
     </w:p>
     <w:p>
-      <w:pPr>
-        <w:pStyle w:val="ListBullet"/>
-        <w:spacing w:before="0" w:after="40" w:line="264" w:lineRule="auto"/>
-      </w:pPr>
       <w:r>
-        <w:rPr>
-          <w:rFonts w:ascii="Calibri" w:hAnsi="Calibri"/>
-          <w:b w:val="0"/>
-          <w:color w:val="222222"/>
-          <w:sz w:val="19"/>
-        </w:rPr>
-        <w:t>Systems &amp; Programming Languages:</w:t>
-      </w:r>
-      <w:r>
-        <w:rPr>
-          <w:rFonts w:ascii="Calibri" w:hAnsi="Calibri"/>
-          <w:b/>
-          <w:color w:val="222222"/>
-          <w:sz w:val="19"/>
-        </w:rPr>
-        <w:t xml:space="preserve"> Python, C/C++, TypeScript, JavaScript, SQL, MATLAB, Bash.</w:t>
+        <w:t xml:space="preserve">  *Senior Lecturer, Department of Computer Engineering*, Ahmadu Bello University, Zaria, Nigeria  </w:t>
       </w:r>
     </w:p>
     <w:p>
-      <w:pPr>
-        <w:pStyle w:val="ListBullet"/>
-        <w:spacing w:before="0" w:after="40" w:line="264" w:lineRule="auto"/>
-      </w:pPr>
       <w:r>
-        <w:rPr>
-          <w:rFonts w:ascii="Calibri" w:hAnsi="Calibri"/>
-          <w:b w:val="0"/>
-          <w:color w:val="222222"/>
-          <w:sz w:val="19"/>
-        </w:rPr>
-        <w:t>Operating Systems &amp; Infrastructure:</w:t>
+        <w:t xml:space="preserve">  Email: `zharuna@abu.edu.ng`</w:t>
       </w:r>
+    </w:p>
+    <w:p/>
+    <w:p>
       <w:r>
-        <w:rPr>
-          <w:rFonts w:ascii="Calibri" w:hAnsi="Calibri"/>
-          <w:b/>
-          <w:color w:val="222222"/>
-          <w:sz w:val="19"/>
-        </w:rPr>
-        <w:t xml:space="preserve"> Linux / OpenEuler, Embedded NPU Toolchains, Docker, Kubernetes, Git, GitHub Actions.</w:t>
+        <w:t xml:space="preserve">* **Dr. Salisu Aliyu**  </w:t>
       </w:r>
     </w:p>
     <w:p>
-      <w:pPr>
-        <w:pStyle w:val="ListBullet"/>
-        <w:spacing w:before="0" w:after="40" w:line="264" w:lineRule="auto"/>
-      </w:pPr>
       <w:r>
-        <w:rPr>
-          <w:rFonts w:ascii="Calibri" w:hAnsi="Calibri"/>
-          <w:b w:val="0"/>
-          <w:color w:val="222222"/>
-          <w:sz w:val="19"/>
-        </w:rPr>
-        <w:t>Databases &amp; Data Systems:</w:t>
-      </w:r>
-      <w:r>
-        <w:rPr>
-          <w:rFonts w:ascii="Calibri" w:hAnsi="Calibri"/>
-          <w:b/>
-          <w:color w:val="222222"/>
-          <w:sz w:val="19"/>
-        </w:rPr>
-        <w:t xml:space="preserve"> PostgreSQL, pgvector, SQLite (WAL mode), Redis, Supabase, Qdrant.</w:t>
+        <w:t xml:space="preserve">  *Senior Lecturer, Department of Computer Science*, Ahmadu Bello University, Zaria, Nigeria  </w:t>
       </w:r>
     </w:p>
+    <w:p>
+      <w:r>
+        <w:t xml:space="preserve">  Email: `aliyusalisu@abu.edu.ng`</w:t>
+      </w:r>
+    </w:p>
+    <w:p/>
     <w:sectPr>
       <w:pgSz w:w="12240" w:h="15840"/>
-      <w:pgMar w:top="936" w:right="1080" w:bottom="936" w:left="1080" w:header="720" w:footer="720" w:gutter="0"/>
+      <w:pgMar w:top="1440" w:right="1800" w:bottom="1440" w:left="1800" w:header="720" w:footer="720" w:gutter="0"/>
       <w:cols w:space="720"/>
       <w:docGrid w:linePitch="360"/>
     </w:sectPr>

</xml_diff>